<commit_message>
new improvements to parse word docs service/client
</commit_message>
<xml_diff>
--- a/sourceDoc.docx
+++ b/sourceDoc.docx
@@ -63,7 +63,23 @@
         <w:t>Hello Word!</w:t>
       </w:r>
     </w:p>
-    <w:p/>
+    <w:p>
+      <w:pPr>
+        <w:rPr>
+          <w:rFonts w:ascii="Times New Roman" w:hAnsi="Times New Roman" w:cs="Times New Roman"/>
+          <w:sz w:val="48"/>
+          <w:szCs w:val="48"/>
+        </w:rPr>
+      </w:pPr>
+      <w:r>
+        <w:rPr>
+          <w:rFonts w:ascii="Times New Roman" w:hAnsi="Times New Roman" w:cs="Times New Roman"/>
+          <w:sz w:val="48"/>
+          <w:szCs w:val="48"/>
+        </w:rPr>
+        <w:t>testing</w:t>
+      </w:r>
+    </w:p>
     <w:p>
       <w:pPr>
         <w:pStyle w:val="custom2"/>
@@ -86,7 +102,23 @@
         <w:t xml:space="preserve"> Word</w:t>
       </w:r>
     </w:p>
-    <w:p/>
+    <w:p>
+      <w:pPr>
+        <w:rPr>
+          <w:rFonts w:ascii="Times New Roman" w:hAnsi="Times New Roman" w:cs="Times New Roman"/>
+          <w:sz w:val="56"/>
+          <w:szCs w:val="56"/>
+        </w:rPr>
+      </w:pPr>
+      <w:r>
+        <w:rPr>
+          <w:rFonts w:ascii="Times New Roman" w:hAnsi="Times New Roman" w:cs="Times New Roman"/>
+          <w:sz w:val="56"/>
+          <w:szCs w:val="56"/>
+        </w:rPr>
+        <w:t>Development</w:t>
+      </w:r>
+    </w:p>
     <w:p>
       <w:r>
         <w:t>My Text</w:t>
@@ -382,7 +414,59 @@
       </w:r>
       <w:proofErr w:type="spellEnd"/>
     </w:p>
-    <w:p/>
+    <w:p>
+      <w:pPr>
+        <w:rPr>
+          <w:rFonts w:ascii="ADLaM Display" w:hAnsi="ADLaM Display" w:cs="ADLaM Display"/>
+          <w:sz w:val="40"/>
+          <w:szCs w:val="40"/>
+        </w:rPr>
+      </w:pPr>
+      <w:r>
+        <w:rPr>
+          <w:rFonts w:ascii="ADLaM Display" w:hAnsi="ADLaM Display" w:cs="ADLaM Display"/>
+          <w:sz w:val="40"/>
+          <w:szCs w:val="40"/>
+        </w:rPr>
+        <w:t>Inline Change</w:t>
+      </w:r>
+    </w:p>
+    <w:p>
+      <w:pPr>
+        <w:rPr>
+          <w:rFonts w:ascii="ADLaM Display" w:hAnsi="ADLaM Display" w:cs="ADLaM Display"/>
+          <w:sz w:val="40"/>
+          <w:szCs w:val="40"/>
+        </w:rPr>
+      </w:pPr>
+    </w:p>
+    <w:p>
+      <w:pPr>
+        <w:pStyle w:val="Title"/>
+        <w:rPr>
+          <w:rFonts w:ascii="Algerian" w:hAnsi="Algerian"/>
+        </w:rPr>
+      </w:pPr>
+      <w:r>
+        <w:rPr>
+          <w:rFonts w:ascii="Algerian" w:hAnsi="Algerian"/>
+        </w:rPr>
+        <w:t>Style A</w:t>
+      </w:r>
+    </w:p>
+    <w:p>
+      <w:r>
+        <w:t>Style B</w:t>
+      </w:r>
+    </w:p>
+    <w:p>
+      <w:pPr>
+        <w:pStyle w:val="custom2"/>
+        <w:rPr>
+          <w:rFonts w:ascii="Algerian" w:hAnsi="Algerian"/>
+        </w:rPr>
+      </w:pPr>
+    </w:p>
     <w:sectPr>
       <w:pgSz w:w="12240" w:h="15840"/>
       <w:pgMar w:top="1440" w:right="1440" w:bottom="1440" w:left="1440" w:header="720" w:footer="720" w:gutter="0"/>

</xml_diff>